<commit_message>
Apply form: agency-name dropdown + duplicate-partner guard
</commit_message>
<xml_diff>
--- a/docs/USER_MANUAL.docx
+++ b/docs/USER_MANUAL.docx
@@ -4579,6 +4579,53 @@
       </w:r>
       <w:r>
         <w:t xml:space="preserve">.</w:t>
+      </w:r>
+    </w:p>
+    <w:p>
+      <w:pPr>
+        <w:pStyle w:val="BodyText"/>
+      </w:pPr>
+      <w:r>
+        <w:rPr>
+          <w:bCs/>
+          <w:b/>
+        </w:rPr>
+        <w:t xml:space="preserve">Duplicate prevention.</w:t>
+      </w:r>
+      <w:r>
+        <w:t xml:space="preserve"> </w:t>
+      </w:r>
+      <w:r>
+        <w:t xml:space="preserve">As the applicant types the</w:t>
+      </w:r>
+      <w:r>
+        <w:t xml:space="preserve"> </w:t>
+      </w:r>
+      <w:r>
+        <w:rPr>
+          <w:bCs/>
+          <w:b/>
+        </w:rPr>
+        <w:t xml:space="preserve">Agency name</w:t>
+      </w:r>
+      <w:r>
+        <w:t xml:space="preserve">, any already-approved partner whose name matches appears in a dropdown. If they pick an existing agency (or type an exact-name match), the form warns that the agency is already registered and</w:t>
+      </w:r>
+      <w:r>
+        <w:t xml:space="preserve"> </w:t>
+      </w:r>
+      <w:r>
+        <w:rPr>
+          <w:bCs/>
+          <w:b/>
+        </w:rPr>
+        <w:t xml:space="preserve">blocks the submission</w:t>
+      </w:r>
+      <w:r>
+        <w:t xml:space="preserve"> </w:t>
+      </w:r>
+      <w:r>
+        <w:t xml:space="preserve">— steering a new caseworker at an existing partner to request an invitation instead of creating a duplicate agency. The dropdown is fed by the public approved-agency list, so no private data is exposed.</w:t>
       </w:r>
     </w:p>
     <w:p>

</xml_diff>

<commit_message>
Agency dedup: submit guard, reviewer flags, contact reuse, apply banner, guarded unique index
</commit_message>
<xml_diff>
--- a/docs/USER_MANUAL.docx
+++ b/docs/USER_MANUAL.docx
@@ -4596,6 +4596,30 @@
         <w:t xml:space="preserve"> </w:t>
       </w:r>
       <w:r>
+        <w:t xml:space="preserve">Several layers keep duplicate agencies out:</w:t>
+      </w:r>
+    </w:p>
+    <w:p>
+      <w:pPr>
+        <w:numPr>
+          <w:ilvl w:val="0"/>
+          <w:numId w:val="1021"/>
+        </w:numPr>
+        <w:pStyle w:val="Compact"/>
+      </w:pPr>
+      <w:r>
+        <w:t xml:space="preserve">A green banner at the top of the form tells returning partners' new caseworkers to request an invitation instead of applying.</w:t>
+      </w:r>
+    </w:p>
+    <w:p>
+      <w:pPr>
+        <w:numPr>
+          <w:ilvl w:val="0"/>
+          <w:numId w:val="1021"/>
+        </w:numPr>
+        <w:pStyle w:val="Compact"/>
+      </w:pPr>
+      <w:r>
         <w:t xml:space="preserve">As the applicant types the</w:t>
       </w:r>
       <w:r>
@@ -4609,7 +4633,7 @@
         <w:t xml:space="preserve">Agency name</w:t>
       </w:r>
       <w:r>
-        <w:t xml:space="preserve">, any already-approved partner whose name matches appears in a dropdown. If they pick an existing agency (or type an exact-name match), the form warns that the agency is already registered and</w:t>
+        <w:t xml:space="preserve">, any already-approved partner whose name matches appears in a dropdown; picking one (or typing an exact-name match) warns them and</w:t>
       </w:r>
       <w:r>
         <w:t xml:space="preserve"> </w:t>
@@ -4622,15 +4646,52 @@
         <w:t xml:space="preserve">blocks the submission</w:t>
       </w:r>
       <w:r>
-        <w:t xml:space="preserve"> </w:t>
-      </w:r>
-      <w:r>
-        <w:t xml:space="preserve">— steering a new caseworker at an existing partner to request an invitation instead of creating a duplicate agency. The dropdown is fed by the public approved-agency list, so no private data is exposed.</w:t>
-      </w:r>
-    </w:p>
-    <w:p>
-      <w:pPr>
-        <w:pStyle w:val="BodyText"/>
+        <w:t xml:space="preserve">. The dropdown is fed by the public approved-agency list, so no private data is exposed.</w:t>
+      </w:r>
+    </w:p>
+    <w:p>
+      <w:pPr>
+        <w:numPr>
+          <w:ilvl w:val="0"/>
+          <w:numId w:val="1021"/>
+        </w:numPr>
+        <w:pStyle w:val="Compact"/>
+      </w:pPr>
+      <w:r>
+        <w:t xml:space="preserve">The server independently rejects any submission whose normalized agency name</w:t>
+      </w:r>
+      <w:r>
+        <w:t xml:space="preserve"> </w:t>
+      </w:r>
+      <w:r>
+        <w:rPr>
+          <w:bCs/>
+          <w:b/>
+        </w:rPr>
+        <w:t xml:space="preserve">or EIN</w:t>
+      </w:r>
+      <w:r>
+        <w:t xml:space="preserve"> </w:t>
+      </w:r>
+      <w:r>
+        <w:t xml:space="preserve">already belongs to an approved partner — so a duplicate can't sneak through even if someone posts to the endpoint directly.</w:t>
+      </w:r>
+    </w:p>
+    <w:p>
+      <w:pPr>
+        <w:numPr>
+          <w:ilvl w:val="0"/>
+          <w:numId w:val="1021"/>
+        </w:numPr>
+        <w:pStyle w:val="Compact"/>
+      </w:pPr>
+      <w:r>
+        <w:t xml:space="preserve">A data-layer unique index makes two approved agencies with the same normalized name impossible (added automatically only when existing data is already clean, so it never disrupts an upgrade).</w:t>
+      </w:r>
+    </w:p>
+    <w:p>
+      <w:pPr>
+        <w:pStyle w:val="FirstParagraph"/>
       </w:pPr>
       <w:r>
         <w:t xml:space="preserve">The form is rate-limited (5 per 15 minutes per IP) and honeypot-guarded, so bot fills are dropped silently.</w:t>
@@ -4707,14 +4768,27 @@
         <w:pStyle w:val="BodyText"/>
       </w:pPr>
       <w:r>
-        <w:t xml:space="preserve">Clicking a pending row shows the full application detail. Three actions:</w:t>
-      </w:r>
-    </w:p>
-    <w:p>
-      <w:pPr>
-        <w:numPr>
-          <w:ilvl w:val="0"/>
-          <w:numId w:val="1021"/>
+        <w:t xml:space="preserve">Clicking a pending row shows the full application detail. If the system spots a</w:t>
+      </w:r>
+      <w:r>
+        <w:t xml:space="preserve"> </w:t>
+      </w:r>
+      <w:r>
+        <w:rPr>
+          <w:bCs/>
+          <w:b/>
+        </w:rPr>
+        <w:t xml:space="preserve">possible duplicate</w:t>
+      </w:r>
+      <w:r>
+        <w:t xml:space="preserve">, an amber warning appears at the top of the detail listing any already-approved agency that matches by name, EIN, or main email, and any caseworker email that already belongs to a registered caseworker — so you can reject a duplicate instead of approving a second copy. Three actions:</w:t>
+      </w:r>
+    </w:p>
+    <w:p>
+      <w:pPr>
+        <w:numPr>
+          <w:ilvl w:val="0"/>
+          <w:numId w:val="1022"/>
         </w:numPr>
         <w:pStyle w:val="Compact"/>
       </w:pPr>
@@ -4788,12 +4862,28 @@
       <w:r>
         <w:t xml:space="preserve">and back-links the newly created agency.</w:t>
       </w:r>
-    </w:p>
-    <w:p>
-      <w:pPr>
-        <w:numPr>
-          <w:ilvl w:val="0"/>
-          <w:numId w:val="1021"/>
+      <w:r>
+        <w:t xml:space="preserve"> </w:t>
+      </w:r>
+      <w:r>
+        <w:rPr>
+          <w:bCs/>
+          <w:b/>
+        </w:rPr>
+        <w:t xml:space="preserve">De-dup at approval:</w:t>
+      </w:r>
+      <w:r>
+        <w:t xml:space="preserve"> </w:t>
+      </w:r>
+      <w:r>
+        <w:t xml:space="preserve">if a caseworker's email already exists as a contact, that existing person is reused (linked to the new agency) instead of creating a duplicate contact; and if an approved agency already has the same normalized name, the approval is refused with a clear message so you can reject the duplicate instead.</w:t>
+      </w:r>
+    </w:p>
+    <w:p>
+      <w:pPr>
+        <w:numPr>
+          <w:ilvl w:val="0"/>
+          <w:numId w:val="1022"/>
         </w:numPr>
         <w:pStyle w:val="Compact"/>
       </w:pPr>
@@ -4830,7 +4920,7 @@
       <w:pPr>
         <w:numPr>
           <w:ilvl w:val="0"/>
-          <w:numId w:val="1021"/>
+          <w:numId w:val="1022"/>
         </w:numPr>
         <w:pStyle w:val="Compact"/>
       </w:pPr>
@@ -5037,7 +5127,7 @@
       <w:pPr>
         <w:numPr>
           <w:ilvl w:val="0"/>
-          <w:numId w:val="1022"/>
+          <w:numId w:val="1023"/>
         </w:numPr>
         <w:pStyle w:val="Compact"/>
       </w:pPr>
@@ -5058,7 +5148,7 @@
       <w:pPr>
         <w:numPr>
           <w:ilvl w:val="0"/>
-          <w:numId w:val="1022"/>
+          <w:numId w:val="1023"/>
         </w:numPr>
         <w:pStyle w:val="Compact"/>
       </w:pPr>
@@ -5097,7 +5187,7 @@
       <w:pPr>
         <w:numPr>
           <w:ilvl w:val="0"/>
-          <w:numId w:val="1022"/>
+          <w:numId w:val="1023"/>
         </w:numPr>
         <w:pStyle w:val="Compact"/>
       </w:pPr>
@@ -5171,7 +5261,7 @@
       <w:pPr>
         <w:numPr>
           <w:ilvl w:val="0"/>
-          <w:numId w:val="1023"/>
+          <w:numId w:val="1024"/>
         </w:numPr>
         <w:pStyle w:val="Compact"/>
       </w:pPr>
@@ -5209,7 +5299,7 @@
       <w:pPr>
         <w:numPr>
           <w:ilvl w:val="0"/>
-          <w:numId w:val="1023"/>
+          <w:numId w:val="1024"/>
         </w:numPr>
         <w:pStyle w:val="Compact"/>
       </w:pPr>
@@ -5231,7 +5321,7 @@
       <w:pPr>
         <w:numPr>
           <w:ilvl w:val="0"/>
-          <w:numId w:val="1023"/>
+          <w:numId w:val="1024"/>
         </w:numPr>
         <w:pStyle w:val="Compact"/>
       </w:pPr>
@@ -5294,7 +5384,7 @@
       <w:pPr>
         <w:numPr>
           <w:ilvl w:val="0"/>
-          <w:numId w:val="1024"/>
+          <w:numId w:val="1025"/>
         </w:numPr>
         <w:pStyle w:val="Compact"/>
       </w:pPr>
@@ -5316,7 +5406,7 @@
       <w:pPr>
         <w:numPr>
           <w:ilvl w:val="0"/>
-          <w:numId w:val="1024"/>
+          <w:numId w:val="1025"/>
         </w:numPr>
         <w:pStyle w:val="Compact"/>
       </w:pPr>
@@ -5379,7 +5469,7 @@
       <w:pPr>
         <w:numPr>
           <w:ilvl w:val="0"/>
-          <w:numId w:val="1025"/>
+          <w:numId w:val="1026"/>
         </w:numPr>
         <w:pStyle w:val="Compact"/>
       </w:pPr>
@@ -5401,7 +5491,7 @@
       <w:pPr>
         <w:numPr>
           <w:ilvl w:val="0"/>
-          <w:numId w:val="1025"/>
+          <w:numId w:val="1026"/>
         </w:numPr>
         <w:pStyle w:val="Compact"/>
       </w:pPr>
@@ -5458,7 +5548,7 @@
       <w:pPr>
         <w:numPr>
           <w:ilvl w:val="0"/>
-          <w:numId w:val="1025"/>
+          <w:numId w:val="1026"/>
         </w:numPr>
         <w:pStyle w:val="Compact"/>
       </w:pPr>
@@ -5563,7 +5653,7 @@
       <w:pPr>
         <w:numPr>
           <w:ilvl w:val="0"/>
-          <w:numId w:val="1026"/>
+          <w:numId w:val="1027"/>
         </w:numPr>
         <w:pStyle w:val="Compact"/>
       </w:pPr>
@@ -5604,7 +5694,7 @@
       <w:pPr>
         <w:numPr>
           <w:ilvl w:val="0"/>
-          <w:numId w:val="1026"/>
+          <w:numId w:val="1027"/>
         </w:numPr>
         <w:pStyle w:val="Compact"/>
       </w:pPr>
@@ -5616,7 +5706,7 @@
       <w:pPr>
         <w:numPr>
           <w:ilvl w:val="0"/>
-          <w:numId w:val="1026"/>
+          <w:numId w:val="1027"/>
         </w:numPr>
         <w:pStyle w:val="Compact"/>
       </w:pPr>
@@ -5755,7 +5845,7 @@
       <w:pPr>
         <w:numPr>
           <w:ilvl w:val="0"/>
-          <w:numId w:val="1027"/>
+          <w:numId w:val="1028"/>
         </w:numPr>
         <w:pStyle w:val="Compact"/>
       </w:pPr>
@@ -5767,7 +5857,7 @@
       <w:pPr>
         <w:numPr>
           <w:ilvl w:val="0"/>
-          <w:numId w:val="1027"/>
+          <w:numId w:val="1028"/>
         </w:numPr>
         <w:pStyle w:val="Compact"/>
       </w:pPr>
@@ -5779,7 +5869,7 @@
       <w:pPr>
         <w:numPr>
           <w:ilvl w:val="0"/>
-          <w:numId w:val="1027"/>
+          <w:numId w:val="1028"/>
         </w:numPr>
         <w:pStyle w:val="Compact"/>
       </w:pPr>
@@ -5833,7 +5923,7 @@
       <w:pPr>
         <w:numPr>
           <w:ilvl w:val="0"/>
-          <w:numId w:val="1028"/>
+          <w:numId w:val="1029"/>
         </w:numPr>
         <w:pStyle w:val="Compact"/>
       </w:pPr>
@@ -5845,7 +5935,7 @@
       <w:pPr>
         <w:numPr>
           <w:ilvl w:val="0"/>
-          <w:numId w:val="1028"/>
+          <w:numId w:val="1029"/>
         </w:numPr>
         <w:pStyle w:val="Compact"/>
       </w:pPr>
@@ -5857,7 +5947,7 @@
       <w:pPr>
         <w:numPr>
           <w:ilvl w:val="0"/>
-          <w:numId w:val="1028"/>
+          <w:numId w:val="1029"/>
         </w:numPr>
         <w:pStyle w:val="Compact"/>
       </w:pPr>
@@ -5930,7 +6020,7 @@
       <w:pPr>
         <w:numPr>
           <w:ilvl w:val="0"/>
-          <w:numId w:val="1029"/>
+          <w:numId w:val="1030"/>
         </w:numPr>
         <w:pStyle w:val="Compact"/>
       </w:pPr>
@@ -5942,7 +6032,7 @@
       <w:pPr>
         <w:numPr>
           <w:ilvl w:val="0"/>
-          <w:numId w:val="1029"/>
+          <w:numId w:val="1030"/>
         </w:numPr>
         <w:pStyle w:val="Compact"/>
       </w:pPr>
@@ -5954,7 +6044,7 @@
       <w:pPr>
         <w:numPr>
           <w:ilvl w:val="0"/>
-          <w:numId w:val="1029"/>
+          <w:numId w:val="1030"/>
         </w:numPr>
         <w:pStyle w:val="Compact"/>
       </w:pPr>
@@ -6000,7 +6090,7 @@
       <w:pPr>
         <w:numPr>
           <w:ilvl w:val="0"/>
-          <w:numId w:val="1030"/>
+          <w:numId w:val="1031"/>
         </w:numPr>
         <w:pStyle w:val="Compact"/>
       </w:pPr>
@@ -6012,7 +6102,7 @@
       <w:pPr>
         <w:numPr>
           <w:ilvl w:val="0"/>
-          <w:numId w:val="1030"/>
+          <w:numId w:val="1031"/>
         </w:numPr>
         <w:pStyle w:val="Compact"/>
       </w:pPr>
@@ -6024,7 +6114,7 @@
       <w:pPr>
         <w:numPr>
           <w:ilvl w:val="0"/>
-          <w:numId w:val="1030"/>
+          <w:numId w:val="1031"/>
         </w:numPr>
         <w:pStyle w:val="Compact"/>
       </w:pPr>
@@ -6106,7 +6196,7 @@
       <w:pPr>
         <w:numPr>
           <w:ilvl w:val="0"/>
-          <w:numId w:val="1031"/>
+          <w:numId w:val="1032"/>
         </w:numPr>
         <w:pStyle w:val="Compact"/>
       </w:pPr>
@@ -6147,7 +6237,7 @@
       <w:pPr>
         <w:numPr>
           <w:ilvl w:val="0"/>
-          <w:numId w:val="1031"/>
+          <w:numId w:val="1032"/>
         </w:numPr>
         <w:pStyle w:val="Compact"/>
       </w:pPr>
@@ -6172,7 +6262,7 @@
       <w:pPr>
         <w:numPr>
           <w:ilvl w:val="0"/>
-          <w:numId w:val="1031"/>
+          <w:numId w:val="1032"/>
         </w:numPr>
         <w:pStyle w:val="Compact"/>
       </w:pPr>
@@ -6184,7 +6274,7 @@
       <w:pPr>
         <w:numPr>
           <w:ilvl w:val="0"/>
-          <w:numId w:val="1031"/>
+          <w:numId w:val="1032"/>
         </w:numPr>
         <w:pStyle w:val="Compact"/>
       </w:pPr>
@@ -6212,7 +6302,7 @@
       <w:pPr>
         <w:numPr>
           <w:ilvl w:val="0"/>
-          <w:numId w:val="1031"/>
+          <w:numId w:val="1032"/>
         </w:numPr>
         <w:pStyle w:val="Compact"/>
       </w:pPr>
@@ -6237,7 +6327,7 @@
       <w:pPr>
         <w:numPr>
           <w:ilvl w:val="0"/>
-          <w:numId w:val="1031"/>
+          <w:numId w:val="1032"/>
         </w:numPr>
         <w:pStyle w:val="Compact"/>
       </w:pPr>
@@ -6296,7 +6386,7 @@
       <w:pPr>
         <w:numPr>
           <w:ilvl w:val="0"/>
-          <w:numId w:val="1032"/>
+          <w:numId w:val="1033"/>
         </w:numPr>
         <w:pStyle w:val="Compact"/>
       </w:pPr>
@@ -6321,7 +6411,7 @@
       <w:pPr>
         <w:numPr>
           <w:ilvl w:val="0"/>
-          <w:numId w:val="1032"/>
+          <w:numId w:val="1033"/>
         </w:numPr>
         <w:pStyle w:val="Compact"/>
       </w:pPr>
@@ -6349,7 +6439,7 @@
       <w:pPr>
         <w:numPr>
           <w:ilvl w:val="0"/>
-          <w:numId w:val="1032"/>
+          <w:numId w:val="1033"/>
         </w:numPr>
         <w:pStyle w:val="Compact"/>
       </w:pPr>
@@ -6361,7 +6451,7 @@
       <w:pPr>
         <w:numPr>
           <w:ilvl w:val="0"/>
-          <w:numId w:val="1032"/>
+          <w:numId w:val="1033"/>
         </w:numPr>
         <w:pStyle w:val="Compact"/>
       </w:pPr>
@@ -6373,7 +6463,7 @@
       <w:pPr>
         <w:numPr>
           <w:ilvl w:val="0"/>
-          <w:numId w:val="1032"/>
+          <w:numId w:val="1033"/>
         </w:numPr>
         <w:pStyle w:val="Compact"/>
       </w:pPr>
@@ -6422,7 +6512,7 @@
       <w:pPr>
         <w:numPr>
           <w:ilvl w:val="0"/>
-          <w:numId w:val="1033"/>
+          <w:numId w:val="1034"/>
         </w:numPr>
         <w:pStyle w:val="Compact"/>
       </w:pPr>
@@ -6444,7 +6534,7 @@
       <w:pPr>
         <w:numPr>
           <w:ilvl w:val="0"/>
-          <w:numId w:val="1033"/>
+          <w:numId w:val="1034"/>
         </w:numPr>
         <w:pStyle w:val="Compact"/>
       </w:pPr>
@@ -6456,7 +6546,7 @@
       <w:pPr>
         <w:numPr>
           <w:ilvl w:val="0"/>
-          <w:numId w:val="1033"/>
+          <w:numId w:val="1034"/>
         </w:numPr>
         <w:pStyle w:val="Compact"/>
       </w:pPr>
@@ -6484,7 +6574,7 @@
       <w:pPr>
         <w:numPr>
           <w:ilvl w:val="0"/>
-          <w:numId w:val="1033"/>
+          <w:numId w:val="1034"/>
         </w:numPr>
         <w:pStyle w:val="Compact"/>
       </w:pPr>
@@ -6602,7 +6692,7 @@
       <w:pPr>
         <w:numPr>
           <w:ilvl w:val="0"/>
-          <w:numId w:val="1034"/>
+          <w:numId w:val="1035"/>
         </w:numPr>
         <w:pStyle w:val="Compact"/>
       </w:pPr>
@@ -6614,7 +6704,7 @@
       <w:pPr>
         <w:numPr>
           <w:ilvl w:val="0"/>
-          <w:numId w:val="1034"/>
+          <w:numId w:val="1035"/>
         </w:numPr>
         <w:pStyle w:val="Compact"/>
       </w:pPr>
@@ -6642,7 +6732,7 @@
       <w:pPr>
         <w:numPr>
           <w:ilvl w:val="0"/>
-          <w:numId w:val="1034"/>
+          <w:numId w:val="1035"/>
         </w:numPr>
         <w:pStyle w:val="Compact"/>
       </w:pPr>
@@ -6664,7 +6754,7 @@
       <w:pPr>
         <w:numPr>
           <w:ilvl w:val="0"/>
-          <w:numId w:val="1034"/>
+          <w:numId w:val="1035"/>
         </w:numPr>
         <w:pStyle w:val="Compact"/>
       </w:pPr>
@@ -6697,7 +6787,7 @@
       <w:pPr>
         <w:numPr>
           <w:ilvl w:val="0"/>
-          <w:numId w:val="1035"/>
+          <w:numId w:val="1036"/>
         </w:numPr>
         <w:pStyle w:val="Compact"/>
       </w:pPr>
@@ -6719,7 +6809,7 @@
       <w:pPr>
         <w:numPr>
           <w:ilvl w:val="0"/>
-          <w:numId w:val="1035"/>
+          <w:numId w:val="1036"/>
         </w:numPr>
         <w:pStyle w:val="Compact"/>
       </w:pPr>
@@ -6741,7 +6831,7 @@
       <w:pPr>
         <w:numPr>
           <w:ilvl w:val="0"/>
-          <w:numId w:val="1035"/>
+          <w:numId w:val="1036"/>
         </w:numPr>
         <w:pStyle w:val="Compact"/>
       </w:pPr>
@@ -6865,7 +6955,7 @@
       <w:pPr>
         <w:numPr>
           <w:ilvl w:val="0"/>
-          <w:numId w:val="1036"/>
+          <w:numId w:val="1037"/>
         </w:numPr>
         <w:pStyle w:val="Compact"/>
       </w:pPr>
@@ -6877,7 +6967,7 @@
       <w:pPr>
         <w:numPr>
           <w:ilvl w:val="0"/>
-          <w:numId w:val="1036"/>
+          <w:numId w:val="1037"/>
         </w:numPr>
         <w:pStyle w:val="Compact"/>
       </w:pPr>
@@ -6889,7 +6979,7 @@
       <w:pPr>
         <w:numPr>
           <w:ilvl w:val="0"/>
-          <w:numId w:val="1036"/>
+          <w:numId w:val="1037"/>
         </w:numPr>
         <w:pStyle w:val="Compact"/>
       </w:pPr>
@@ -6901,7 +6991,7 @@
       <w:pPr>
         <w:numPr>
           <w:ilvl w:val="0"/>
-          <w:numId w:val="1036"/>
+          <w:numId w:val="1037"/>
         </w:numPr>
         <w:pStyle w:val="Compact"/>
       </w:pPr>
@@ -6913,7 +7003,7 @@
       <w:pPr>
         <w:numPr>
           <w:ilvl w:val="0"/>
-          <w:numId w:val="1036"/>
+          <w:numId w:val="1037"/>
         </w:numPr>
         <w:pStyle w:val="Compact"/>
       </w:pPr>
@@ -6925,7 +7015,7 @@
       <w:pPr>
         <w:numPr>
           <w:ilvl w:val="0"/>
-          <w:numId w:val="1036"/>
+          <w:numId w:val="1037"/>
         </w:numPr>
         <w:pStyle w:val="Compact"/>
       </w:pPr>
@@ -6937,7 +7027,7 @@
       <w:pPr>
         <w:numPr>
           <w:ilvl w:val="0"/>
-          <w:numId w:val="1036"/>
+          <w:numId w:val="1037"/>
         </w:numPr>
         <w:pStyle w:val="Compact"/>
       </w:pPr>
@@ -6949,7 +7039,7 @@
       <w:pPr>
         <w:numPr>
           <w:ilvl w:val="0"/>
-          <w:numId w:val="1036"/>
+          <w:numId w:val="1037"/>
         </w:numPr>
         <w:pStyle w:val="Compact"/>
       </w:pPr>
@@ -6961,7 +7051,7 @@
       <w:pPr>
         <w:numPr>
           <w:ilvl w:val="0"/>
-          <w:numId w:val="1036"/>
+          <w:numId w:val="1037"/>
         </w:numPr>
         <w:pStyle w:val="Compact"/>
       </w:pPr>
@@ -6973,7 +7063,7 @@
       <w:pPr>
         <w:numPr>
           <w:ilvl w:val="0"/>
-          <w:numId w:val="1036"/>
+          <w:numId w:val="1037"/>
         </w:numPr>
         <w:pStyle w:val="Compact"/>
       </w:pPr>
@@ -6985,7 +7075,7 @@
       <w:pPr>
         <w:numPr>
           <w:ilvl w:val="0"/>
-          <w:numId w:val="1036"/>
+          <w:numId w:val="1037"/>
         </w:numPr>
         <w:pStyle w:val="Compact"/>
       </w:pPr>
@@ -6997,7 +7087,7 @@
       <w:pPr>
         <w:numPr>
           <w:ilvl w:val="0"/>
-          <w:numId w:val="1036"/>
+          <w:numId w:val="1037"/>
         </w:numPr>
         <w:pStyle w:val="Compact"/>
       </w:pPr>
@@ -7009,7 +7099,7 @@
       <w:pPr>
         <w:numPr>
           <w:ilvl w:val="0"/>
-          <w:numId w:val="1036"/>
+          <w:numId w:val="1037"/>
         </w:numPr>
         <w:pStyle w:val="Compact"/>
       </w:pPr>
@@ -7021,7 +7111,7 @@
       <w:pPr>
         <w:numPr>
           <w:ilvl w:val="0"/>
-          <w:numId w:val="1036"/>
+          <w:numId w:val="1037"/>
         </w:numPr>
         <w:pStyle w:val="Compact"/>
       </w:pPr>
@@ -7033,7 +7123,7 @@
       <w:pPr>
         <w:numPr>
           <w:ilvl w:val="0"/>
-          <w:numId w:val="1036"/>
+          <w:numId w:val="1037"/>
         </w:numPr>
         <w:pStyle w:val="Compact"/>
       </w:pPr>
@@ -7045,7 +7135,7 @@
       <w:pPr>
         <w:numPr>
           <w:ilvl w:val="0"/>
-          <w:numId w:val="1036"/>
+          <w:numId w:val="1037"/>
         </w:numPr>
         <w:pStyle w:val="Compact"/>
       </w:pPr>
@@ -7237,7 +7327,7 @@
       <w:pPr>
         <w:numPr>
           <w:ilvl w:val="0"/>
-          <w:numId w:val="1037"/>
+          <w:numId w:val="1038"/>
         </w:numPr>
         <w:pStyle w:val="Compact"/>
       </w:pPr>
@@ -7265,7 +7355,7 @@
       <w:pPr>
         <w:numPr>
           <w:ilvl w:val="0"/>
-          <w:numId w:val="1037"/>
+          <w:numId w:val="1038"/>
         </w:numPr>
         <w:pStyle w:val="Compact"/>
       </w:pPr>
@@ -7293,7 +7383,7 @@
       <w:pPr>
         <w:numPr>
           <w:ilvl w:val="0"/>
-          <w:numId w:val="1037"/>
+          <w:numId w:val="1038"/>
         </w:numPr>
         <w:pStyle w:val="Compact"/>
       </w:pPr>
@@ -7352,7 +7442,7 @@
       <w:pPr>
         <w:numPr>
           <w:ilvl w:val="0"/>
-          <w:numId w:val="1038"/>
+          <w:numId w:val="1039"/>
         </w:numPr>
         <w:pStyle w:val="Compact"/>
       </w:pPr>
@@ -7374,7 +7464,7 @@
       <w:pPr>
         <w:numPr>
           <w:ilvl w:val="0"/>
-          <w:numId w:val="1038"/>
+          <w:numId w:val="1039"/>
         </w:numPr>
         <w:pStyle w:val="Compact"/>
       </w:pPr>
@@ -7396,7 +7486,7 @@
       <w:pPr>
         <w:numPr>
           <w:ilvl w:val="0"/>
-          <w:numId w:val="1038"/>
+          <w:numId w:val="1039"/>
         </w:numPr>
         <w:pStyle w:val="Compact"/>
       </w:pPr>
@@ -7702,7 +7792,7 @@
       <w:pPr>
         <w:numPr>
           <w:ilvl w:val="0"/>
-          <w:numId w:val="1039"/>
+          <w:numId w:val="1040"/>
         </w:numPr>
         <w:pStyle w:val="Compact"/>
       </w:pPr>
@@ -7724,7 +7814,7 @@
       <w:pPr>
         <w:numPr>
           <w:ilvl w:val="0"/>
-          <w:numId w:val="1039"/>
+          <w:numId w:val="1040"/>
         </w:numPr>
         <w:pStyle w:val="Compact"/>
       </w:pPr>
@@ -7756,7 +7846,7 @@
       <w:pPr>
         <w:numPr>
           <w:ilvl w:val="0"/>
-          <w:numId w:val="1040"/>
+          <w:numId w:val="1041"/>
         </w:numPr>
         <w:pStyle w:val="Compact"/>
       </w:pPr>
@@ -7778,7 +7868,7 @@
       <w:pPr>
         <w:numPr>
           <w:ilvl w:val="0"/>
-          <w:numId w:val="1041"/>
+          <w:numId w:val="1042"/>
         </w:numPr>
         <w:pStyle w:val="Compact"/>
       </w:pPr>
@@ -7806,7 +7896,7 @@
       <w:pPr>
         <w:numPr>
           <w:ilvl w:val="0"/>
-          <w:numId w:val="1041"/>
+          <w:numId w:val="1042"/>
         </w:numPr>
         <w:pStyle w:val="Compact"/>
       </w:pPr>
@@ -7818,7 +7908,7 @@
       <w:pPr>
         <w:numPr>
           <w:ilvl w:val="0"/>
-          <w:numId w:val="1041"/>
+          <w:numId w:val="1042"/>
         </w:numPr>
         <w:pStyle w:val="Compact"/>
       </w:pPr>
@@ -7840,7 +7930,7 @@
       <w:pPr>
         <w:numPr>
           <w:ilvl w:val="0"/>
-          <w:numId w:val="1042"/>
+          <w:numId w:val="1043"/>
         </w:numPr>
         <w:pStyle w:val="Compact"/>
       </w:pPr>
@@ -7886,7 +7976,7 @@
       <w:pPr>
         <w:numPr>
           <w:ilvl w:val="0"/>
-          <w:numId w:val="1043"/>
+          <w:numId w:val="1044"/>
         </w:numPr>
         <w:pStyle w:val="Compact"/>
       </w:pPr>
@@ -7908,7 +7998,7 @@
       <w:pPr>
         <w:numPr>
           <w:ilvl w:val="0"/>
-          <w:numId w:val="1043"/>
+          <w:numId w:val="1044"/>
         </w:numPr>
         <w:pStyle w:val="Compact"/>
       </w:pPr>
@@ -7930,7 +8020,7 @@
       <w:pPr>
         <w:numPr>
           <w:ilvl w:val="0"/>
-          <w:numId w:val="1043"/>
+          <w:numId w:val="1044"/>
         </w:numPr>
         <w:pStyle w:val="Compact"/>
       </w:pPr>
@@ -7952,7 +8042,7 @@
       <w:pPr>
         <w:numPr>
           <w:ilvl w:val="0"/>
-          <w:numId w:val="1043"/>
+          <w:numId w:val="1044"/>
         </w:numPr>
         <w:pStyle w:val="Compact"/>
       </w:pPr>
@@ -8096,7 +8186,7 @@
       <w:pPr>
         <w:numPr>
           <w:ilvl w:val="0"/>
-          <w:numId w:val="1044"/>
+          <w:numId w:val="1045"/>
         </w:numPr>
         <w:pStyle w:val="Compact"/>
       </w:pPr>
@@ -8137,7 +8227,7 @@
       <w:pPr>
         <w:numPr>
           <w:ilvl w:val="0"/>
-          <w:numId w:val="1044"/>
+          <w:numId w:val="1045"/>
         </w:numPr>
         <w:pStyle w:val="Compact"/>
       </w:pPr>
@@ -8165,7 +8255,7 @@
       <w:pPr>
         <w:numPr>
           <w:ilvl w:val="0"/>
-          <w:numId w:val="1044"/>
+          <w:numId w:val="1045"/>
         </w:numPr>
         <w:pStyle w:val="Compact"/>
       </w:pPr>
@@ -8190,7 +8280,7 @@
       <w:pPr>
         <w:numPr>
           <w:ilvl w:val="0"/>
-          <w:numId w:val="1044"/>
+          <w:numId w:val="1045"/>
         </w:numPr>
         <w:pStyle w:val="Compact"/>
       </w:pPr>
@@ -8218,7 +8308,7 @@
       <w:pPr>
         <w:numPr>
           <w:ilvl w:val="0"/>
-          <w:numId w:val="1044"/>
+          <w:numId w:val="1045"/>
         </w:numPr>
         <w:pStyle w:val="Compact"/>
       </w:pPr>
@@ -8240,7 +8330,7 @@
       <w:pPr>
         <w:numPr>
           <w:ilvl w:val="0"/>
-          <w:numId w:val="1045"/>
+          <w:numId w:val="1046"/>
         </w:numPr>
         <w:pStyle w:val="Compact"/>
       </w:pPr>
@@ -8281,7 +8371,7 @@
       <w:pPr>
         <w:numPr>
           <w:ilvl w:val="0"/>
-          <w:numId w:val="1045"/>
+          <w:numId w:val="1046"/>
         </w:numPr>
         <w:pStyle w:val="Compact"/>
       </w:pPr>
@@ -8306,7 +8396,7 @@
       <w:pPr>
         <w:numPr>
           <w:ilvl w:val="0"/>
-          <w:numId w:val="1045"/>
+          <w:numId w:val="1046"/>
         </w:numPr>
         <w:pStyle w:val="Compact"/>
       </w:pPr>
@@ -8352,7 +8442,7 @@
       <w:pPr>
         <w:numPr>
           <w:ilvl w:val="0"/>
-          <w:numId w:val="1046"/>
+          <w:numId w:val="1047"/>
         </w:numPr>
         <w:pStyle w:val="Compact"/>
       </w:pPr>
@@ -8393,7 +8483,7 @@
       <w:pPr>
         <w:numPr>
           <w:ilvl w:val="0"/>
-          <w:numId w:val="1046"/>
+          <w:numId w:val="1047"/>
         </w:numPr>
         <w:pStyle w:val="Compact"/>
       </w:pPr>
@@ -8421,7 +8511,7 @@
       <w:pPr>
         <w:numPr>
           <w:ilvl w:val="0"/>
-          <w:numId w:val="1046"/>
+          <w:numId w:val="1047"/>
         </w:numPr>
         <w:pStyle w:val="Compact"/>
       </w:pPr>
@@ -8443,7 +8533,7 @@
       <w:pPr>
         <w:numPr>
           <w:ilvl w:val="0"/>
-          <w:numId w:val="1047"/>
+          <w:numId w:val="1048"/>
         </w:numPr>
         <w:pStyle w:val="Compact"/>
       </w:pPr>
@@ -8468,7 +8558,7 @@
       <w:pPr>
         <w:numPr>
           <w:ilvl w:val="0"/>
-          <w:numId w:val="1047"/>
+          <w:numId w:val="1048"/>
         </w:numPr>
         <w:pStyle w:val="Compact"/>
       </w:pPr>
@@ -8480,7 +8570,7 @@
       <w:pPr>
         <w:numPr>
           <w:ilvl w:val="0"/>
-          <w:numId w:val="1047"/>
+          <w:numId w:val="1048"/>
         </w:numPr>
         <w:pStyle w:val="Compact"/>
       </w:pPr>
@@ -8589,7 +8679,7 @@
       <w:pPr>
         <w:numPr>
           <w:ilvl w:val="0"/>
-          <w:numId w:val="1048"/>
+          <w:numId w:val="1049"/>
         </w:numPr>
         <w:pStyle w:val="Compact"/>
       </w:pPr>
@@ -8613,7 +8703,7 @@
       <w:pPr>
         <w:numPr>
           <w:ilvl w:val="0"/>
-          <w:numId w:val="1048"/>
+          <w:numId w:val="1049"/>
         </w:numPr>
         <w:pStyle w:val="Compact"/>
       </w:pPr>
@@ -8625,7 +8715,7 @@
       <w:pPr>
         <w:numPr>
           <w:ilvl w:val="0"/>
-          <w:numId w:val="1048"/>
+          <w:numId w:val="1049"/>
         </w:numPr>
         <w:pStyle w:val="Compact"/>
       </w:pPr>
@@ -8679,7 +8769,7 @@
       <w:pPr>
         <w:numPr>
           <w:ilvl w:val="0"/>
-          <w:numId w:val="1049"/>
+          <w:numId w:val="1050"/>
         </w:numPr>
         <w:pStyle w:val="Compact"/>
       </w:pPr>
@@ -8746,7 +8836,7 @@
       <w:pPr>
         <w:numPr>
           <w:ilvl w:val="0"/>
-          <w:numId w:val="1049"/>
+          <w:numId w:val="1050"/>
         </w:numPr>
         <w:pStyle w:val="Compact"/>
       </w:pPr>
@@ -9242,7 +9332,7 @@
       <w:pPr>
         <w:numPr>
           <w:ilvl w:val="0"/>
-          <w:numId w:val="1050"/>
+          <w:numId w:val="1051"/>
         </w:numPr>
         <w:pStyle w:val="Compact"/>
       </w:pPr>
@@ -9283,7 +9373,7 @@
       <w:pPr>
         <w:numPr>
           <w:ilvl w:val="0"/>
-          <w:numId w:val="1050"/>
+          <w:numId w:val="1051"/>
         </w:numPr>
         <w:pStyle w:val="Compact"/>
       </w:pPr>
@@ -9343,7 +9433,7 @@
       <w:pPr>
         <w:numPr>
           <w:ilvl w:val="0"/>
-          <w:numId w:val="1050"/>
+          <w:numId w:val="1051"/>
         </w:numPr>
         <w:pStyle w:val="Compact"/>
       </w:pPr>
@@ -9355,7 +9445,7 @@
       <w:pPr>
         <w:numPr>
           <w:ilvl w:val="0"/>
-          <w:numId w:val="1050"/>
+          <w:numId w:val="1051"/>
         </w:numPr>
         <w:pStyle w:val="Compact"/>
       </w:pPr>
@@ -9383,7 +9473,7 @@
       <w:pPr>
         <w:numPr>
           <w:ilvl w:val="0"/>
-          <w:numId w:val="1050"/>
+          <w:numId w:val="1051"/>
         </w:numPr>
         <w:pStyle w:val="Compact"/>
       </w:pPr>
@@ -9448,7 +9538,7 @@
       <w:pPr>
         <w:numPr>
           <w:ilvl w:val="0"/>
-          <w:numId w:val="1051"/>
+          <w:numId w:val="1052"/>
         </w:numPr>
         <w:pStyle w:val="Compact"/>
       </w:pPr>
@@ -9470,7 +9560,7 @@
       <w:pPr>
         <w:numPr>
           <w:ilvl w:val="0"/>
-          <w:numId w:val="1051"/>
+          <w:numId w:val="1052"/>
         </w:numPr>
         <w:pStyle w:val="Compact"/>
       </w:pPr>
@@ -9563,7 +9653,7 @@
       <w:pPr>
         <w:numPr>
           <w:ilvl w:val="0"/>
-          <w:numId w:val="1052"/>
+          <w:numId w:val="1053"/>
         </w:numPr>
         <w:pStyle w:val="Compact"/>
       </w:pPr>
@@ -9575,7 +9665,7 @@
       <w:pPr>
         <w:numPr>
           <w:ilvl w:val="0"/>
-          <w:numId w:val="1052"/>
+          <w:numId w:val="1053"/>
         </w:numPr>
         <w:pStyle w:val="Compact"/>
       </w:pPr>
@@ -9587,7 +9677,7 @@
       <w:pPr>
         <w:numPr>
           <w:ilvl w:val="0"/>
-          <w:numId w:val="1052"/>
+          <w:numId w:val="1053"/>
         </w:numPr>
         <w:pStyle w:val="Compact"/>
       </w:pPr>
@@ -9599,7 +9689,7 @@
       <w:pPr>
         <w:numPr>
           <w:ilvl w:val="0"/>
-          <w:numId w:val="1052"/>
+          <w:numId w:val="1053"/>
         </w:numPr>
         <w:pStyle w:val="Compact"/>
       </w:pPr>
@@ -9611,7 +9701,7 @@
       <w:pPr>
         <w:numPr>
           <w:ilvl w:val="0"/>
-          <w:numId w:val="1052"/>
+          <w:numId w:val="1053"/>
         </w:numPr>
         <w:pStyle w:val="Compact"/>
       </w:pPr>
@@ -9694,7 +9784,7 @@
       <w:pPr>
         <w:numPr>
           <w:ilvl w:val="0"/>
-          <w:numId w:val="1053"/>
+          <w:numId w:val="1054"/>
         </w:numPr>
         <w:pStyle w:val="Compact"/>
       </w:pPr>
@@ -9716,7 +9806,7 @@
       <w:pPr>
         <w:numPr>
           <w:ilvl w:val="0"/>
-          <w:numId w:val="1053"/>
+          <w:numId w:val="1054"/>
         </w:numPr>
         <w:pStyle w:val="Compact"/>
       </w:pPr>
@@ -9738,7 +9828,7 @@
       <w:pPr>
         <w:numPr>
           <w:ilvl w:val="0"/>
-          <w:numId w:val="1053"/>
+          <w:numId w:val="1054"/>
         </w:numPr>
         <w:pStyle w:val="Compact"/>
       </w:pPr>
@@ -9802,7 +9892,7 @@
       <w:pPr>
         <w:numPr>
           <w:ilvl w:val="0"/>
-          <w:numId w:val="1054"/>
+          <w:numId w:val="1055"/>
         </w:numPr>
         <w:pStyle w:val="Compact"/>
       </w:pPr>
@@ -9843,7 +9933,7 @@
       <w:pPr>
         <w:numPr>
           <w:ilvl w:val="0"/>
-          <w:numId w:val="1054"/>
+          <w:numId w:val="1055"/>
         </w:numPr>
         <w:pStyle w:val="Compact"/>
       </w:pPr>
@@ -9855,7 +9945,7 @@
       <w:pPr>
         <w:numPr>
           <w:ilvl w:val="0"/>
-          <w:numId w:val="1054"/>
+          <w:numId w:val="1055"/>
         </w:numPr>
         <w:pStyle w:val="Compact"/>
       </w:pPr>
@@ -9867,7 +9957,7 @@
       <w:pPr>
         <w:numPr>
           <w:ilvl w:val="0"/>
-          <w:numId w:val="1054"/>
+          <w:numId w:val="1055"/>
         </w:numPr>
         <w:pStyle w:val="Compact"/>
       </w:pPr>
@@ -9911,7 +10001,7 @@
       <w:pPr>
         <w:numPr>
           <w:ilvl w:val="0"/>
-          <w:numId w:val="1054"/>
+          <w:numId w:val="1055"/>
         </w:numPr>
         <w:pStyle w:val="Compact"/>
       </w:pPr>
@@ -9989,7 +10079,7 @@
       <w:pPr>
         <w:numPr>
           <w:ilvl w:val="0"/>
-          <w:numId w:val="1055"/>
+          <w:numId w:val="1056"/>
         </w:numPr>
         <w:pStyle w:val="Compact"/>
       </w:pPr>
@@ -10014,7 +10104,7 @@
       <w:pPr>
         <w:numPr>
           <w:ilvl w:val="0"/>
-          <w:numId w:val="1055"/>
+          <w:numId w:val="1056"/>
         </w:numPr>
         <w:pStyle w:val="Compact"/>
       </w:pPr>
@@ -10026,7 +10116,7 @@
       <w:pPr>
         <w:numPr>
           <w:ilvl w:val="0"/>
-          <w:numId w:val="1055"/>
+          <w:numId w:val="1056"/>
         </w:numPr>
         <w:pStyle w:val="Compact"/>
       </w:pPr>
@@ -10097,7 +10187,7 @@
       <w:pPr>
         <w:numPr>
           <w:ilvl w:val="0"/>
-          <w:numId w:val="1056"/>
+          <w:numId w:val="1057"/>
         </w:numPr>
         <w:pStyle w:val="Compact"/>
       </w:pPr>
@@ -10119,7 +10209,7 @@
       <w:pPr>
         <w:numPr>
           <w:ilvl w:val="0"/>
-          <w:numId w:val="1056"/>
+          <w:numId w:val="1057"/>
         </w:numPr>
         <w:pStyle w:val="Compact"/>
       </w:pPr>
@@ -10141,7 +10231,7 @@
       <w:pPr>
         <w:numPr>
           <w:ilvl w:val="0"/>
-          <w:numId w:val="1056"/>
+          <w:numId w:val="1057"/>
         </w:numPr>
         <w:pStyle w:val="Compact"/>
       </w:pPr>
@@ -10173,7 +10263,7 @@
       <w:pPr>
         <w:numPr>
           <w:ilvl w:val="0"/>
-          <w:numId w:val="1057"/>
+          <w:numId w:val="1058"/>
         </w:numPr>
         <w:pStyle w:val="Compact"/>
       </w:pPr>
@@ -10195,7 +10285,7 @@
       <w:pPr>
         <w:numPr>
           <w:ilvl w:val="0"/>
-          <w:numId w:val="1057"/>
+          <w:numId w:val="1058"/>
         </w:numPr>
         <w:pStyle w:val="Compact"/>
       </w:pPr>
@@ -10217,7 +10307,7 @@
       <w:pPr>
         <w:numPr>
           <w:ilvl w:val="0"/>
-          <w:numId w:val="1057"/>
+          <w:numId w:val="1058"/>
         </w:numPr>
         <w:pStyle w:val="Compact"/>
       </w:pPr>
@@ -10264,7 +10354,7 @@
       <w:pPr>
         <w:numPr>
           <w:ilvl w:val="0"/>
-          <w:numId w:val="1058"/>
+          <w:numId w:val="1059"/>
         </w:numPr>
         <w:pStyle w:val="Compact"/>
       </w:pPr>
@@ -10286,7 +10376,7 @@
       <w:pPr>
         <w:numPr>
           <w:ilvl w:val="0"/>
-          <w:numId w:val="1058"/>
+          <w:numId w:val="1059"/>
         </w:numPr>
         <w:pStyle w:val="Compact"/>
       </w:pPr>
@@ -10308,7 +10398,7 @@
       <w:pPr>
         <w:numPr>
           <w:ilvl w:val="0"/>
-          <w:numId w:val="1058"/>
+          <w:numId w:val="1059"/>
         </w:numPr>
         <w:pStyle w:val="Compact"/>
       </w:pPr>
@@ -10340,7 +10430,7 @@
       <w:pPr>
         <w:numPr>
           <w:ilvl w:val="0"/>
-          <w:numId w:val="1059"/>
+          <w:numId w:val="1060"/>
         </w:numPr>
         <w:pStyle w:val="Compact"/>
       </w:pPr>
@@ -10362,7 +10452,7 @@
       <w:pPr>
         <w:numPr>
           <w:ilvl w:val="0"/>
-          <w:numId w:val="1059"/>
+          <w:numId w:val="1060"/>
         </w:numPr>
         <w:pStyle w:val="Compact"/>
       </w:pPr>
@@ -10426,7 +10516,7 @@
       <w:pPr>
         <w:numPr>
           <w:ilvl w:val="0"/>
-          <w:numId w:val="1060"/>
+          <w:numId w:val="1061"/>
         </w:numPr>
         <w:pStyle w:val="Compact"/>
       </w:pPr>
@@ -10448,7 +10538,7 @@
       <w:pPr>
         <w:numPr>
           <w:ilvl w:val="0"/>
-          <w:numId w:val="1060"/>
+          <w:numId w:val="1061"/>
         </w:numPr>
         <w:pStyle w:val="Compact"/>
       </w:pPr>
@@ -10470,7 +10560,7 @@
       <w:pPr>
         <w:numPr>
           <w:ilvl w:val="0"/>
-          <w:numId w:val="1060"/>
+          <w:numId w:val="1061"/>
         </w:numPr>
         <w:pStyle w:val="Compact"/>
       </w:pPr>
@@ -10510,7 +10600,7 @@
       <w:pPr>
         <w:numPr>
           <w:ilvl w:val="0"/>
-          <w:numId w:val="1061"/>
+          <w:numId w:val="1062"/>
         </w:numPr>
         <w:pStyle w:val="Compact"/>
       </w:pPr>
@@ -10538,7 +10628,7 @@
       <w:pPr>
         <w:numPr>
           <w:ilvl w:val="0"/>
-          <w:numId w:val="1061"/>
+          <w:numId w:val="1062"/>
         </w:numPr>
         <w:pStyle w:val="Compact"/>
       </w:pPr>
@@ -10566,7 +10656,7 @@
       <w:pPr>
         <w:numPr>
           <w:ilvl w:val="0"/>
-          <w:numId w:val="1061"/>
+          <w:numId w:val="1062"/>
         </w:numPr>
         <w:pStyle w:val="Compact"/>
       </w:pPr>
@@ -10614,7 +10704,7 @@
       <w:pPr>
         <w:numPr>
           <w:ilvl w:val="0"/>
-          <w:numId w:val="1062"/>
+          <w:numId w:val="1063"/>
         </w:numPr>
         <w:pStyle w:val="Compact"/>
       </w:pPr>
@@ -10626,7 +10716,7 @@
       <w:pPr>
         <w:numPr>
           <w:ilvl w:val="0"/>
-          <w:numId w:val="1062"/>
+          <w:numId w:val="1063"/>
         </w:numPr>
         <w:pStyle w:val="Compact"/>
       </w:pPr>
@@ -10664,7 +10754,7 @@
       <w:pPr>
         <w:numPr>
           <w:ilvl w:val="0"/>
-          <w:numId w:val="1062"/>
+          <w:numId w:val="1063"/>
         </w:numPr>
         <w:pStyle w:val="Compact"/>
       </w:pPr>
@@ -10703,7 +10793,7 @@
       <w:pPr>
         <w:numPr>
           <w:ilvl w:val="0"/>
-          <w:numId w:val="1062"/>
+          <w:numId w:val="1063"/>
         </w:numPr>
         <w:pStyle w:val="Compact"/>
       </w:pPr>
@@ -10769,7 +10859,7 @@
       <w:pPr>
         <w:numPr>
           <w:ilvl w:val="0"/>
-          <w:numId w:val="1062"/>
+          <w:numId w:val="1063"/>
         </w:numPr>
         <w:pStyle w:val="Compact"/>
       </w:pPr>
@@ -10799,7 +10889,7 @@
       <w:pPr>
         <w:numPr>
           <w:ilvl w:val="0"/>
-          <w:numId w:val="1063"/>
+          <w:numId w:val="1064"/>
         </w:numPr>
         <w:pStyle w:val="Compact"/>
       </w:pPr>
@@ -10811,7 +10901,7 @@
       <w:pPr>
         <w:numPr>
           <w:ilvl w:val="0"/>
-          <w:numId w:val="1063"/>
+          <w:numId w:val="1064"/>
         </w:numPr>
         <w:pStyle w:val="Compact"/>
       </w:pPr>
@@ -10823,7 +10913,7 @@
       <w:pPr>
         <w:numPr>
           <w:ilvl w:val="0"/>
-          <w:numId w:val="1063"/>
+          <w:numId w:val="1064"/>
         </w:numPr>
         <w:pStyle w:val="Compact"/>
       </w:pPr>
@@ -11464,6 +11554,9 @@
     <w:abstractNumId w:val="991"/>
   </w:num>
   <w:num w:numId="1026">
+    <w:abstractNumId w:val="991"/>
+  </w:num>
+  <w:num w:numId="1027">
     <w:abstractNumId w:val="99411"/>
     <w:lvlOverride w:ilvl="0">
       <w:startOverride w:val="1"/>
@@ -11492,9 +11585,6 @@
     <w:lvlOverride w:ilvl="8">
       <w:startOverride w:val="1"/>
     </w:lvlOverride>
-  </w:num>
-  <w:num w:numId="1027">
-    <w:abstractNumId w:val="991"/>
   </w:num>
   <w:num w:numId="1028">
     <w:abstractNumId w:val="991"/>
@@ -11506,34 +11596,7 @@
     <w:abstractNumId w:val="991"/>
   </w:num>
   <w:num w:numId="1031">
-    <w:abstractNumId w:val="99411"/>
-    <w:lvlOverride w:ilvl="0">
-      <w:startOverride w:val="1"/>
-    </w:lvlOverride>
-    <w:lvlOverride w:ilvl="1">
-      <w:startOverride w:val="1"/>
-    </w:lvlOverride>
-    <w:lvlOverride w:ilvl="2">
-      <w:startOverride w:val="1"/>
-    </w:lvlOverride>
-    <w:lvlOverride w:ilvl="3">
-      <w:startOverride w:val="1"/>
-    </w:lvlOverride>
-    <w:lvlOverride w:ilvl="4">
-      <w:startOverride w:val="1"/>
-    </w:lvlOverride>
-    <w:lvlOverride w:ilvl="5">
-      <w:startOverride w:val="1"/>
-    </w:lvlOverride>
-    <w:lvlOverride w:ilvl="6">
-      <w:startOverride w:val="1"/>
-    </w:lvlOverride>
-    <w:lvlOverride w:ilvl="7">
-      <w:startOverride w:val="1"/>
-    </w:lvlOverride>
-    <w:lvlOverride w:ilvl="8">
-      <w:startOverride w:val="1"/>
-    </w:lvlOverride>
+    <w:abstractNumId w:val="991"/>
   </w:num>
   <w:num w:numId="1032">
     <w:abstractNumId w:val="99411"/>
@@ -11626,7 +11689,34 @@
     </w:lvlOverride>
   </w:num>
   <w:num w:numId="1035">
-    <w:abstractNumId w:val="991"/>
+    <w:abstractNumId w:val="99411"/>
+    <w:lvlOverride w:ilvl="0">
+      <w:startOverride w:val="1"/>
+    </w:lvlOverride>
+    <w:lvlOverride w:ilvl="1">
+      <w:startOverride w:val="1"/>
+    </w:lvlOverride>
+    <w:lvlOverride w:ilvl="2">
+      <w:startOverride w:val="1"/>
+    </w:lvlOverride>
+    <w:lvlOverride w:ilvl="3">
+      <w:startOverride w:val="1"/>
+    </w:lvlOverride>
+    <w:lvlOverride w:ilvl="4">
+      <w:startOverride w:val="1"/>
+    </w:lvlOverride>
+    <w:lvlOverride w:ilvl="5">
+      <w:startOverride w:val="1"/>
+    </w:lvlOverride>
+    <w:lvlOverride w:ilvl="6">
+      <w:startOverride w:val="1"/>
+    </w:lvlOverride>
+    <w:lvlOverride w:ilvl="7">
+      <w:startOverride w:val="1"/>
+    </w:lvlOverride>
+    <w:lvlOverride w:ilvl="8">
+      <w:startOverride w:val="1"/>
+    </w:lvlOverride>
   </w:num>
   <w:num w:numId="1036">
     <w:abstractNumId w:val="991"/>
@@ -11650,34 +11740,7 @@
     <w:abstractNumId w:val="991"/>
   </w:num>
   <w:num w:numId="1043">
-    <w:abstractNumId w:val="99411"/>
-    <w:lvlOverride w:ilvl="0">
-      <w:startOverride w:val="1"/>
-    </w:lvlOverride>
-    <w:lvlOverride w:ilvl="1">
-      <w:startOverride w:val="1"/>
-    </w:lvlOverride>
-    <w:lvlOverride w:ilvl="2">
-      <w:startOverride w:val="1"/>
-    </w:lvlOverride>
-    <w:lvlOverride w:ilvl="3">
-      <w:startOverride w:val="1"/>
-    </w:lvlOverride>
-    <w:lvlOverride w:ilvl="4">
-      <w:startOverride w:val="1"/>
-    </w:lvlOverride>
-    <w:lvlOverride w:ilvl="5">
-      <w:startOverride w:val="1"/>
-    </w:lvlOverride>
-    <w:lvlOverride w:ilvl="6">
-      <w:startOverride w:val="1"/>
-    </w:lvlOverride>
-    <w:lvlOverride w:ilvl="7">
-      <w:startOverride w:val="1"/>
-    </w:lvlOverride>
-    <w:lvlOverride w:ilvl="8">
-      <w:startOverride w:val="1"/>
-    </w:lvlOverride>
+    <w:abstractNumId w:val="991"/>
   </w:num>
   <w:num w:numId="1044">
     <w:abstractNumId w:val="99411"/>
@@ -11830,9 +11893,39 @@
     </w:lvlOverride>
   </w:num>
   <w:num w:numId="1049">
+    <w:abstractNumId w:val="99411"/>
+    <w:lvlOverride w:ilvl="0">
+      <w:startOverride w:val="1"/>
+    </w:lvlOverride>
+    <w:lvlOverride w:ilvl="1">
+      <w:startOverride w:val="1"/>
+    </w:lvlOverride>
+    <w:lvlOverride w:ilvl="2">
+      <w:startOverride w:val="1"/>
+    </w:lvlOverride>
+    <w:lvlOverride w:ilvl="3">
+      <w:startOverride w:val="1"/>
+    </w:lvlOverride>
+    <w:lvlOverride w:ilvl="4">
+      <w:startOverride w:val="1"/>
+    </w:lvlOverride>
+    <w:lvlOverride w:ilvl="5">
+      <w:startOverride w:val="1"/>
+    </w:lvlOverride>
+    <w:lvlOverride w:ilvl="6">
+      <w:startOverride w:val="1"/>
+    </w:lvlOverride>
+    <w:lvlOverride w:ilvl="7">
+      <w:startOverride w:val="1"/>
+    </w:lvlOverride>
+    <w:lvlOverride w:ilvl="8">
+      <w:startOverride w:val="1"/>
+    </w:lvlOverride>
+  </w:num>
+  <w:num w:numId="1050">
     <w:abstractNumId w:val="991"/>
   </w:num>
-  <w:num w:numId="1050">
+  <w:num w:numId="1051">
     <w:abstractNumId w:val="99411"/>
     <w:lvlOverride w:ilvl="0">
       <w:startOverride w:val="1"/>
@@ -11861,9 +11954,6 @@
     <w:lvlOverride w:ilvl="8">
       <w:startOverride w:val="1"/>
     </w:lvlOverride>
-  </w:num>
-  <w:num w:numId="1051">
-    <w:abstractNumId w:val="991"/>
   </w:num>
   <w:num w:numId="1052">
     <w:abstractNumId w:val="991"/>
@@ -11872,34 +11962,7 @@
     <w:abstractNumId w:val="991"/>
   </w:num>
   <w:num w:numId="1054">
-    <w:abstractNumId w:val="99411"/>
-    <w:lvlOverride w:ilvl="0">
-      <w:startOverride w:val="1"/>
-    </w:lvlOverride>
-    <w:lvlOverride w:ilvl="1">
-      <w:startOverride w:val="1"/>
-    </w:lvlOverride>
-    <w:lvlOverride w:ilvl="2">
-      <w:startOverride w:val="1"/>
-    </w:lvlOverride>
-    <w:lvlOverride w:ilvl="3">
-      <w:startOverride w:val="1"/>
-    </w:lvlOverride>
-    <w:lvlOverride w:ilvl="4">
-      <w:startOverride w:val="1"/>
-    </w:lvlOverride>
-    <w:lvlOverride w:ilvl="5">
-      <w:startOverride w:val="1"/>
-    </w:lvlOverride>
-    <w:lvlOverride w:ilvl="6">
-      <w:startOverride w:val="1"/>
-    </w:lvlOverride>
-    <w:lvlOverride w:ilvl="7">
-      <w:startOverride w:val="1"/>
-    </w:lvlOverride>
-    <w:lvlOverride w:ilvl="8">
-      <w:startOverride w:val="1"/>
-    </w:lvlOverride>
+    <w:abstractNumId w:val="991"/>
   </w:num>
   <w:num w:numId="1055">
     <w:abstractNumId w:val="99411"/>
@@ -11932,7 +11995,34 @@
     </w:lvlOverride>
   </w:num>
   <w:num w:numId="1056">
-    <w:abstractNumId w:val="991"/>
+    <w:abstractNumId w:val="99411"/>
+    <w:lvlOverride w:ilvl="0">
+      <w:startOverride w:val="1"/>
+    </w:lvlOverride>
+    <w:lvlOverride w:ilvl="1">
+      <w:startOverride w:val="1"/>
+    </w:lvlOverride>
+    <w:lvlOverride w:ilvl="2">
+      <w:startOverride w:val="1"/>
+    </w:lvlOverride>
+    <w:lvlOverride w:ilvl="3">
+      <w:startOverride w:val="1"/>
+    </w:lvlOverride>
+    <w:lvlOverride w:ilvl="4">
+      <w:startOverride w:val="1"/>
+    </w:lvlOverride>
+    <w:lvlOverride w:ilvl="5">
+      <w:startOverride w:val="1"/>
+    </w:lvlOverride>
+    <w:lvlOverride w:ilvl="6">
+      <w:startOverride w:val="1"/>
+    </w:lvlOverride>
+    <w:lvlOverride w:ilvl="7">
+      <w:startOverride w:val="1"/>
+    </w:lvlOverride>
+    <w:lvlOverride w:ilvl="8">
+      <w:startOverride w:val="1"/>
+    </w:lvlOverride>
   </w:num>
   <w:num w:numId="1057">
     <w:abstractNumId w:val="991"/>
@@ -11947,34 +12037,7 @@
     <w:abstractNumId w:val="991"/>
   </w:num>
   <w:num w:numId="1061">
-    <w:abstractNumId w:val="99411"/>
-    <w:lvlOverride w:ilvl="0">
-      <w:startOverride w:val="1"/>
-    </w:lvlOverride>
-    <w:lvlOverride w:ilvl="1">
-      <w:startOverride w:val="1"/>
-    </w:lvlOverride>
-    <w:lvlOverride w:ilvl="2">
-      <w:startOverride w:val="1"/>
-    </w:lvlOverride>
-    <w:lvlOverride w:ilvl="3">
-      <w:startOverride w:val="1"/>
-    </w:lvlOverride>
-    <w:lvlOverride w:ilvl="4">
-      <w:startOverride w:val="1"/>
-    </w:lvlOverride>
-    <w:lvlOverride w:ilvl="5">
-      <w:startOverride w:val="1"/>
-    </w:lvlOverride>
-    <w:lvlOverride w:ilvl="6">
-      <w:startOverride w:val="1"/>
-    </w:lvlOverride>
-    <w:lvlOverride w:ilvl="7">
-      <w:startOverride w:val="1"/>
-    </w:lvlOverride>
-    <w:lvlOverride w:ilvl="8">
-      <w:startOverride w:val="1"/>
-    </w:lvlOverride>
+    <w:abstractNumId w:val="991"/>
   </w:num>
   <w:num w:numId="1062">
     <w:abstractNumId w:val="99411"/>
@@ -12007,6 +12070,36 @@
     </w:lvlOverride>
   </w:num>
   <w:num w:numId="1063">
+    <w:abstractNumId w:val="99411"/>
+    <w:lvlOverride w:ilvl="0">
+      <w:startOverride w:val="1"/>
+    </w:lvlOverride>
+    <w:lvlOverride w:ilvl="1">
+      <w:startOverride w:val="1"/>
+    </w:lvlOverride>
+    <w:lvlOverride w:ilvl="2">
+      <w:startOverride w:val="1"/>
+    </w:lvlOverride>
+    <w:lvlOverride w:ilvl="3">
+      <w:startOverride w:val="1"/>
+    </w:lvlOverride>
+    <w:lvlOverride w:ilvl="4">
+      <w:startOverride w:val="1"/>
+    </w:lvlOverride>
+    <w:lvlOverride w:ilvl="5">
+      <w:startOverride w:val="1"/>
+    </w:lvlOverride>
+    <w:lvlOverride w:ilvl="6">
+      <w:startOverride w:val="1"/>
+    </w:lvlOverride>
+    <w:lvlOverride w:ilvl="7">
+      <w:startOverride w:val="1"/>
+    </w:lvlOverride>
+    <w:lvlOverride w:ilvl="8">
+      <w:startOverride w:val="1"/>
+    </w:lvlOverride>
+  </w:num>
+  <w:num w:numId="1064">
     <w:abstractNumId w:val="991"/>
   </w:num>
 </w:numbering>

</xml_diff>